<commit_message>
Soften quote-merging rule; expand father post with fuller content
- CLAUDE.md §6b: a post's backbone is one continuous segment, but one
  short supplementary fragment from elsewhere in the lecture may now be
  added for fullness (clearly separated, timecoded on its own) — not
  the whole post made of disjointed pieces.
- posts/9: add a note pointing to the softened rule (posts already
  comply, no rewrite needed).
- posts/10 Post 2: expand with its natural continuation (choosing a
  profession, inspired by both parents) plus a short intro line from
  earlier in the interview, explicitly marked as a separate moment.
  Regenerate the .docx.

Co-Authored-By: Claude Sonnet 5 <noreply@anthropic.com>
Claude-Session: https://claude.ai/code/session_0191oBghnP17rwTFx3hL6sTu
</commit_message>
<xml_diff>
--- a/posts/10_posty_VK_intervyu_svetskie.docx
+++ b/posts/10_posty_VK_intervyu_svetskie.docx
@@ -71,6 +71,43 @@
       </w:r>
       <w:r>
         <w:t xml:space="preserve"> два фрагмента, которые понятны и близки даже нерелигиозной аудитории — минимум терминологии, универсальные жизненные темы (семья, труд, характер).</w:t>
+      </w:r>
+    </w:p>
+    <w:p>
+      <w:pPr>
+        <w:pBdr>
+          <w:left w:val="single" w:color="CCCCCC" w:sz="12" w:space="8"/>
+        </w:pBdr>
+        <w:spacing w:after="60"/>
+        <w:ind w:left="480"/>
+      </w:pPr>
+    </w:p>
+    <w:p>
+      <w:pPr>
+        <w:pBdr>
+          <w:left w:val="single" w:color="CCCCCC" w:sz="12" w:space="8"/>
+        </w:pBdr>
+        <w:spacing w:after="60"/>
+        <w:ind w:left="480"/>
+      </w:pPr>
+      <w:r>
+        <w:rPr>
+          <w:b/>
+          <w:bCs/>
+        </w:rPr>
+        <w:t xml:space="preserve">Редакция 2:</w:t>
+      </w:r>
+      <w:r>
+        <w:t xml:space="preserve"> Пост 2 расширен — к основному непрерывному отрезку добавлен его естественное продолжение (выбор профессии) и короткая вступительная фраза из начала интервью (по уточнённому правилу об объединении цитат, см. </w:t>
+      </w:r>
+      <w:r>
+        <w:rPr>
+          <w:rFonts w:ascii="Consolas" w:cs="Consolas" w:eastAsia="Consolas" w:hAnsi="Consolas"/>
+        </w:rPr>
+        <w:t xml:space="preserve">CLAUDE.md</w:t>
+      </w:r>
+      <w:r>
+        <w:t xml:space="preserve"> §6b).</w:t>
       </w:r>
     </w:p>
     <w:p>
@@ -378,7 +415,7 @@
         <w:spacing w:after="100" w:before="200"/>
       </w:pPr>
       <w:r>
-        <w:t xml:space="preserve">Пост 2. Отец научил: кто гонится за результатом — проигрывает</w:t>
+        <w:t xml:space="preserve">Пост 2 (расширенный). Отец научил: кто гонится за результатом — проигрывает</w:t>
       </w:r>
     </w:p>
     <w:p>
@@ -408,6 +445,19 @@
         <w:spacing w:after="60"/>
       </w:pPr>
       <w:r>
+        <w:t xml:space="preserve">В самом начале разговора, рассказывая о семье, он упоминает коротко: «Отец был комбайнёром, ну таким механизатором». А дальше, уже возвращаясь к подростковым годам, рассказывает подробно, чему отец его научил.</w:t>
+      </w:r>
+    </w:p>
+    <w:p>
+      <w:pPr>
+        <w:spacing w:after="80"/>
+      </w:pPr>
+    </w:p>
+    <w:p>
+      <w:pPr>
+        <w:spacing w:after="60"/>
+      </w:pPr>
+      <w:r>
         <w:t xml:space="preserve">Отец меня с тринадцати лет уже брал на комбайн. Весь мой подростковый период, моё становление происходило в таком позитивном самовыражении: ведь для подростка очень важно чувствовать себя полноценным членом общества, делать что-то важное, что делает взрослый, — чувствовать себя взрослым. Отец мне доверял комбайн. Я помню, в тринадцать лет сам управлял этой огромной машиной, чувствовал себя естественно.</w:t>
       </w:r>
     </w:p>
@@ -434,6 +484,19 @@
         <w:spacing w:after="60"/>
       </w:pPr>
       <w:r>
+        <w:t xml:space="preserve">И, собственно, их образ — образ обоих родителей — побудил меня выбрать профессию какую-то смешанную: с одной стороны, профессию интеллектуального труда, а с другой — связанную с комбайном. Я пошёл на конструктора сельхозмашин. Но очень скоро понял, что не буду работать по этой специальности.</w:t>
+      </w:r>
+    </w:p>
+    <w:p>
+      <w:pPr>
+        <w:spacing w:after="80"/>
+      </w:pPr>
+    </w:p>
+    <w:p>
+      <w:pPr>
+        <w:spacing w:after="60"/>
+      </w:pPr>
+      <w:r>
         <w:t xml:space="preserve">——</w:t>
       </w:r>
     </w:p>
@@ -442,7 +505,7 @@
         <w:spacing w:after="60"/>
       </w:pPr>
       <w:r>
-        <w:t xml:space="preserve">🔹 Интервью: </w:t>
+        <w:t xml:space="preserve">🔹 Интервью: вступительная фраза про отца ~01:03–01:12 (отдельный момент интервью) · основной непрерывный рассказ ~06:33–08:34 · ссылка: </w:t>
       </w:r>
       <w:r>
         <w:rPr>
@@ -450,18 +513,6 @@
         </w:rPr>
         <w:t xml:space="preserve">[сверить]</w:t>
       </w:r>
-      <w:r>
-        <w:t xml:space="preserve"> · ссылка: </w:t>
-      </w:r>
-      <w:r>
-        <w:rPr>
-          <w:rFonts w:ascii="Consolas" w:cs="Consolas" w:eastAsia="Consolas" w:hAnsi="Consolas"/>
-        </w:rPr>
-        <w:t xml:space="preserve">[сверить]</w:t>
-      </w:r>
-      <w:r>
-        <w:t xml:space="preserve"> · таймкод ~06:33–08:16</w:t>
-      </w:r>
     </w:p>
     <w:p>
       <w:pPr>
@@ -477,6 +528,14 @@
       </w:pPr>
       <w:r>
         <w:t xml:space="preserve">💬 Почему для светской аудитории: практическая житейская мудрость о труде и характере; пример отца понятен всем, а короткая цитата про «нектар и яд» звучит как универсальный афоризм.</w:t>
+      </w:r>
+    </w:p>
+    <w:p>
+      <w:pPr>
+        <w:spacing w:after="60"/>
+      </w:pPr>
+      <w:r>
+        <w:t xml:space="preserve">📝 По правилу об объединении цитат (CLAUDE.md §6b): основа поста — один непрерывный отрезок (06:33–08:34); вступительная фраза из начала интервью (01:03–01:12) добавлена одним коротким фрагментом для полноты и явно отделена связкой.</w:t>
       </w:r>
     </w:p>
     <w:p>

</xml_diff>